<commit_message>
Add entrance animations to PowerPoint slides across multiple applications. Implement a new function to create light fade-in effects for images and key text, enhancing visual engagement. Update build scripts to apply these animations consistently in generated presentations.
</commit_message>
<xml_diff>
--- a/applications/fid/documents/fid_word.docx
+++ b/applications/fid/documents/fid_word.docx
@@ -136,6 +136,43 @@
           <w:sz w:val="18"/>
         </w:rPr>
         <w:t>FairBanks Community Reach — Health for All — Obulamu eri Bonna · Afya kwa Wote · Oburamu bwa Boona</w:t>
+      </w:r>
+    </w:p>
+    <w:p>
+      <w:pPr>
+        <w:spacing w:after="40" w:before="0" w:line="293" w:lineRule="auto"/>
+        <w:jc w:val="center"/>
+      </w:pPr>
+      <w:r>
+        <w:rPr>
+          <w:rFonts w:ascii="Calibri" w:hAnsi="Calibri" w:eastAsia="Calibri"/>
+          <w:b w:val="0"/>
+          <w:i/>
+          <w:color w:val="3A4A54"/>
+          <w:sz w:val="18"/>
+        </w:rPr>
+        <w:t>Aligned with the Fund for Innovation in Development Call for Proposals 2026.</w:t>
+      </w:r>
+    </w:p>
+    <w:p>
+      <w:pPr>
+        <w:spacing w:after="120" w:before="0" w:line="293" w:lineRule="auto"/>
+        <w:jc w:val="center"/>
+      </w:pPr>
+      <w:r>
+        <w:rPr>
+          <w:rFonts w:ascii="Calibri" w:hAnsi="Calibri" w:eastAsia="Calibri"/>
+          <w:b w:val="0"/>
+          <w:i w:val="0"/>
+          <w:color w:val="0D6E6E"/>
+          <w:sz w:val="16"/>
+        </w:rPr>
+        <w:t>https://opportunitiesforyouth.org/2026/06/12/fid-call-for-proposals-2026-apply-for-up-to-e4-million-to-scale-innovative-solutions-tackling-poverty-and-inequality-worldwide/</w:t>
+      </w:r>
+    </w:p>
+    <w:p>
+      <w:r>
+        <w:br w:type="page"/>
       </w:r>
     </w:p>
     <w:tbl>
@@ -406,43 +443,6 @@
       </w:tr>
     </w:tbl>
     <w:p/>
-    <w:p>
-      <w:pPr>
-        <w:spacing w:after="40" w:before="0" w:line="293" w:lineRule="auto"/>
-        <w:jc w:val="center"/>
-      </w:pPr>
-      <w:r>
-        <w:rPr>
-          <w:rFonts w:ascii="Calibri" w:hAnsi="Calibri" w:eastAsia="Calibri"/>
-          <w:b w:val="0"/>
-          <w:i/>
-          <w:color w:val="3A4A54"/>
-          <w:sz w:val="18"/>
-        </w:rPr>
-        <w:t>Aligned with the Fund for Innovation in Development Call for Proposals 2026.</w:t>
-      </w:r>
-    </w:p>
-    <w:p>
-      <w:pPr>
-        <w:spacing w:after="120" w:before="0" w:line="293" w:lineRule="auto"/>
-        <w:jc w:val="center"/>
-      </w:pPr>
-      <w:r>
-        <w:rPr>
-          <w:rFonts w:ascii="Calibri" w:hAnsi="Calibri" w:eastAsia="Calibri"/>
-          <w:b w:val="0"/>
-          <w:i w:val="0"/>
-          <w:color w:val="0D6E6E"/>
-          <w:sz w:val="16"/>
-        </w:rPr>
-        <w:t>https://opportunitiesforyouth.org/2026/06/12/fid-call-for-proposals-2026-apply-for-up-to-e4-million-to-scale-innovative-solutions-tackling-poverty-and-inequality-worldwide/</w:t>
-      </w:r>
-    </w:p>
-    <w:p>
-      <w:r>
-        <w:br w:type="page"/>
-      </w:r>
-    </w:p>
     <w:p>
       <w:pPr>
         <w:spacing w:before="320" w:after="120"/>

</xml_diff>